<commit_message>
fix: redirect to verified page when signup email link exchange fails
- auth/callback: if exchangeCodeForSession fails for type=signup flows,
  redirect to /login/verified instead of error page — handles cases where
  the PKCE token is already consumed (expired link, re-used link, or
  account confirmed via a previous flow)
- docs: update tinglysning production application — storkunde is confirmed
  via registration for payment of tinglysningsafgift, no separate
  certificate exists
- scripts: remove certificate bilag (bilag 3) from Word document generator,
  update section 5 wording accordingly

Co-Authored-By: Claude Sonnet 4.5 <noreply@anthropic.com>
</commit_message>
<xml_diff>
--- a/docs/tinglysning/download/Ansoegning-eTL-produktionsmiljoe-Pecunia-IT.docx
+++ b/docs/tinglysning/download/Ansoegning-eTL-produktionsmiljoe-Pecunia-IT.docx
@@ -2600,7 +2600,7 @@
           <w:sz w:val="20"/>
           <w:szCs w:val="20"/>
         </w:rPr>
-        <w:t xml:space="preserve">Status: Registrering som storkunde hos SKAT er godkendt.</w:t>
+        <w:t xml:space="preserve">Status: Pecunia IT Consulting ApS er registreret til betaling af tinglysningsafgift, hvilket udgør grundlaget for storkunde-status. Der er ikke udstedt et separat certifikat i forbindelse med registreringen.</w:t>
       </w:r>
     </w:p>
     <w:p>
@@ -2619,7 +2619,7 @@
           <w:sz w:val="20"/>
           <w:szCs w:val="20"/>
         </w:rPr>
-        <w:t xml:space="preserve">Vi fremsender dokumentation for storkunde-registreringen som bilag.</w:t>
+        <w:t xml:space="preserve">Registreringen som storkunde bekræftes ved dokumentation for registrering til betaling af tinglysningsafgift, som vedlægges som bilag.</w:t>
       </w:r>
     </w:p>
     <w:p>
@@ -3137,7 +3137,7 @@
           <w:sz w:val="20"/>
           <w:szCs w:val="20"/>
         </w:rPr>
-        <w:t xml:space="preserve">1. Dokumentation for implementerede services (kode-eksempler pa request/response-handtering)</w:t>
+        <w:t xml:space="preserve">1. Dokumentation for implementerede services (kode-eksempler på request/response-håndtering)</w:t>
       </w:r>
     </w:p>
     <w:p>
@@ -3156,26 +3156,7 @@
           <w:sz w:val="20"/>
           <w:szCs w:val="20"/>
         </w:rPr>
-        <w:t xml:space="preserve">2. Dokumentation for storkunde-registrering hos SKAT</w:t>
-      </w:r>
-    </w:p>
-    <w:p>
-      <w:pPr>
-        <w:pStyle w:val="ListParagraph"/>
-        <w:numPr>
-          <w:ilvl w:val="0"/>
-          <w:numId w:val="1"/>
-        </w:numPr>
-        <w:spacing w:after="60" w:before="60"/>
-      </w:pPr>
-      <w:r>
-        <w:rPr>
-          <w:rFonts w:ascii="Calibri" w:cs="Calibri" w:eastAsia="Calibri" w:hAnsi="Calibri"/>
-          <w:color w:val="1e293b"/>
-          <w:sz w:val="20"/>
-          <w:szCs w:val="20"/>
-        </w:rPr>
-        <w:t xml:space="preserve">3. Systemcertifikat RID: c12026c7-9ef1-4c03-ae26-00f4cb3be7e91 (OCES3 FOCES, udstedt til Pecunia IT Consulting ApS, CVR 44718502, gyldigt 2026-04-01 - 2029-03-31)</w:t>
+        <w:t xml:space="preserve">2. Dokumentation for registrering til betaling af tinglysningsafgift (bekræftelse af storkunde-status hos SKAT)</w:t>
       </w:r>
     </w:p>
     <w:p>

</xml_diff>